<commit_message>
Add filled cover sheet
</commit_message>
<xml_diff>
--- a/Cover_Sheet_Filled.docx
+++ b/Cover_Sheet_Filled.docx
@@ -1032,6 +1032,7 @@
         <w:rPr>
           <w:rFonts w:ascii="Arial" w:hAnsi="Arial"/>
           <w:b w:val="0"/>
+          <w:sz w:val="28"/>
         </w:rPr>
         <w:t xml:space="preserve">Jiayi </w:t>
       </w:r>
@@ -1162,6 +1163,7 @@
         <w:rPr>
           <w:rFonts w:ascii="Arial" w:hAnsi="Arial"/>
           <w:b w:val="0"/>
+          <w:sz w:val="28"/>
         </w:rPr>
         <w:t xml:space="preserve"> Chen</w:t>
       </w:r>
@@ -1374,6 +1376,7 @@
         <w:rPr>
           <w:rFonts w:ascii="Arial" w:hAnsi="Arial"/>
           <w:b w:val="0"/>
+          <w:sz w:val="28"/>
         </w:rPr>
         <w:t xml:space="preserve"> CMNS2016</w:t>
       </w:r>
@@ -1422,6 +1425,7 @@
         <w:rPr>
           <w:rFonts w:ascii="Arial" w:hAnsi="Arial"/>
           <w:b w:val="0"/>
+          <w:sz w:val="28"/>
         </w:rPr>
         <w:t xml:space="preserve"> Social and Interactive Media</w:t>
       </w:r>
@@ -2610,7 +2614,7 @@
         <w:rPr>
           <w:rFonts w:ascii="Arial" w:hAnsi="Arial" w:cs="Arial"/>
         </w:rPr>
-        <w:t xml:space="preserve"> https://hecrereed.github.io/spring-walk/</w:t>
+        <w:t xml:space="preserve"> https://hecre001.github.io/spring-walk/</w:t>
       </w:r>
     </w:p>
     <w:p>

</xml_diff>